<commit_message>
Update resume to include new role as CTO at SmartEdu, detailing responsibilities in leading product and engineering for a multi-tenant school-management SaaS platform. Revise project descriptions to reflect recent work on FairChild and enhance JourneySection with updated timeline entries for clarity and accuracy.
</commit_message>
<xml_diff>
--- a/public/Senior-Full-Stack-Engineer-Resume.docx
+++ b/public/Senior-Full-Stack-Engineer-Resume.docx
@@ -416,6 +416,115 @@
           <w:sz w:val="21"/>
         </w:rPr>
         <w:t>PROFESSIONAL EXPERIENCE</w:t>
+      </w:r>
+    </w:p>
+    <w:p>
+      <w:pPr>
+        <w:tabs>
+          <w:tab w:pos="9792" w:val="decimal"/>
+        </w:tabs>
+        <w:spacing w:before="120" w:after="0"/>
+      </w:pPr>
+      <w:r>
+        <w:rPr>
+          <w:rFonts w:ascii="Calibri" w:hAnsi="Calibri"/>
+          <w:b/>
+          <w:i w:val="0"/>
+          <w:color w:val="1A1A1A"/>
+          <w:sz w:val="20"/>
+        </w:rPr>
+        <w:t>CTO | SmartEdu</w:t>
+      </w:r>
+      <w:r>
+        <w:rPr>
+          <w:rFonts w:ascii="Calibri" w:hAnsi="Calibri"/>
+          <w:b w:val="0"/>
+          <w:i/>
+          <w:color w:val="555555"/>
+          <w:sz w:val="19"/>
+        </w:rPr>
+        <w:tab/>
+        <w:t>2026 - Present</w:t>
+      </w:r>
+    </w:p>
+    <w:p>
+      <w:pPr>
+        <w:spacing w:after="20" w:line="252" w:lineRule="auto"/>
+        <w:ind w:left="288"/>
+      </w:pPr>
+      <w:r>
+        <w:rPr>
+          <w:rFonts w:ascii="Calibri" w:hAnsi="Calibri"/>
+          <w:b w:val="0"/>
+          <w:i w:val="0"/>
+          <w:color w:val="1A1A1A"/>
+          <w:sz w:val="19"/>
+        </w:rPr>
+        <w:t>•  Lead product and engineering for a multi-tenant school-management SaaS platform serving schools across Africa.</w:t>
+      </w:r>
+    </w:p>
+    <w:p>
+      <w:pPr>
+        <w:spacing w:after="20" w:line="252" w:lineRule="auto"/>
+        <w:ind w:left="288"/>
+      </w:pPr>
+      <w:r>
+        <w:rPr>
+          <w:rFonts w:ascii="Calibri" w:hAnsi="Calibri"/>
+          <w:b w:val="0"/>
+          <w:i w:val="0"/>
+          <w:color w:val="1A1A1A"/>
+          <w:sz w:val="19"/>
+        </w:rPr>
+        <w:t>•  Architected a subdomain-per-tenant backend (Node.js, TypeORM, PostgreSQL) with Redis and BullMQ handling report generation, fee reminders, and payment reconciliation.</w:t>
+      </w:r>
+    </w:p>
+    <w:p>
+      <w:pPr>
+        <w:spacing w:after="20" w:line="252" w:lineRule="auto"/>
+        <w:ind w:left="288"/>
+      </w:pPr>
+      <w:r>
+        <w:rPr>
+          <w:rFonts w:ascii="Calibri" w:hAnsi="Calibri"/>
+          <w:b w:val="0"/>
+          <w:i w:val="0"/>
+          <w:color w:val="1A1A1A"/>
+          <w:sz w:val="19"/>
+        </w:rPr>
+        <w:t>•  Structured the frontend as a Turborepo of three Next.js applications sharing a component and design token library.</w:t>
+      </w:r>
+    </w:p>
+    <w:p>
+      <w:pPr>
+        <w:spacing w:after="20" w:line="252" w:lineRule="auto"/>
+        <w:ind w:left="288"/>
+      </w:pPr>
+      <w:r>
+        <w:rPr>
+          <w:rFonts w:ascii="Calibri" w:hAnsi="Calibri"/>
+          <w:b w:val="0"/>
+          <w:i w:val="0"/>
+          <w:color w:val="1A1A1A"/>
+          <w:sz w:val="19"/>
+        </w:rPr>
+        <w:t>•  Integrated Paystack for fee collection, including installment plans and a platform level revenue share.</w:t>
+      </w:r>
+    </w:p>
+    <w:p>
+      <w:pPr>
+        <w:spacing w:after="20" w:line="252" w:lineRule="auto"/>
+        <w:ind w:left="288"/>
+      </w:pPr>
+      <w:r>
+        <w:rPr>
+          <w:rFonts w:ascii="Calibri" w:hAnsi="Calibri"/>
+          <w:b w:val="0"/>
+          <w:i w:val="0"/>
+          <w:color w:val="1A1A1A"/>
+          <w:sz w:val="19"/>
+        </w:rPr>
+        <w:t>•  Own the go-to-market materials and school onboarding process alongside the technical roadmap.</w:t>
       </w:r>
     </w:p>
     <w:p>
@@ -1075,7 +1184,7 @@
           <w:color w:val="1A1A1A"/>
           <w:sz w:val="20"/>
         </w:rPr>
-        <w:t>SmartEdu - Multi-Tenant School Management Platform</w:t>
+        <w:t>FairChild - Institutional Learning Management System</w:t>
       </w:r>
     </w:p>
     <w:p>
@@ -1090,7 +1199,7 @@
           <w:color w:val="555555"/>
           <w:sz w:val="18"/>
         </w:rPr>
-        <w:t>Tech: Next.js, Node.js, TypeScript, PostgreSQL, Redis, BullMQ, Paystack</w:t>
+        <w:t>Tech: React, TypeScript, Node.js, Express, TypeORM, PostgreSQL, Redis, Stripe</w:t>
       </w:r>
     </w:p>
     <w:p>
@@ -1106,7 +1215,7 @@
           <w:color w:val="1A1A1A"/>
           <w:sz w:val="19"/>
         </w:rPr>
-        <w:t>•  Designed a subdomain-per-tenant architecture serving independent schools on one shared platform.</w:t>
+        <w:t>•  Led the build of a Node.js and TypeORM API modeling institution, instructor, staff, and student domains separately.</w:t>
       </w:r>
     </w:p>
     <w:p>
@@ -1122,7 +1231,7 @@
           <w:color w:val="1A1A1A"/>
           <w:sz w:val="19"/>
         </w:rPr>
-        <w:t>•  Built the Node.js and TypeORM backend, using Redis and BullMQ for report generation, fee reminders, and payment reconciliation.</w:t>
+        <w:t>•  Built three React frontends (student, instructor, support portals) consuming the shared API.</w:t>
       </w:r>
     </w:p>
     <w:p>
@@ -1138,7 +1247,7 @@
           <w:color w:val="1A1A1A"/>
           <w:sz w:val="19"/>
         </w:rPr>
-        <w:t>•  Integrated Paystack for fee collection with installment plans and a platform level revenue share.</w:t>
+        <w:t>•  Implemented a Stripe-backed student wallet and payments flow, plus SCORM support for course content.</w:t>
       </w:r>
     </w:p>
     <w:p>
@@ -1154,23 +1263,7 @@
           <w:color w:val="1A1A1A"/>
           <w:sz w:val="19"/>
         </w:rPr>
-        <w:t>•  Structured the frontend as a Turborepo of three Next.js apps sharing a component and design token library.</w:t>
-      </w:r>
-    </w:p>
-    <w:p>
-      <w:pPr>
-        <w:spacing w:after="20" w:line="252" w:lineRule="auto"/>
-        <w:ind w:left="288"/>
-      </w:pPr>
-      <w:r>
-        <w:rPr>
-          <w:rFonts w:ascii="Calibri" w:hAnsi="Calibri"/>
-          <w:b w:val="0"/>
-          <w:i w:val="0"/>
-          <w:color w:val="1A1A1A"/>
-          <w:sz w:val="19"/>
-        </w:rPr>
-        <w:t>•  Shipped to staging and production with CI/CD on every push.</w:t>
+        <w:t>•  Shipped across dev, staging, and production environments with CI/CD, automated backups, and rollback.</w:t>
       </w:r>
     </w:p>
     <w:p>

</xml_diff>